<commit_message>
fix(cell-extraction): changed strategy to additive treshold on original images for low contrast images after CLAHE
</commit_message>
<xml_diff>
--- a/دلایل/New Microsoft Word Document.docx
+++ b/دلایل/New Microsoft Word Document.docx
@@ -2,6 +2,45 @@
 <file path=word/document.xml><?xml version="1.0" encoding="utf-8"?>
 <w:document xmlns:wpc="http://schemas.microsoft.com/office/word/2010/wordprocessingCanvas" xmlns:cx="http://schemas.microsoft.com/office/drawing/2014/chartex" xmlns:cx1="http://schemas.microsoft.com/office/drawing/2015/9/8/chartex" xmlns:cx2="http://schemas.microsoft.com/office/drawing/2015/10/21/chartex" xmlns:cx3="http://schemas.microsoft.com/office/drawing/2016/5/9/chartex" xmlns:cx4="http://schemas.microsoft.com/office/drawing/2016/5/10/chartex" xmlns:cx5="http://schemas.microsoft.com/office/drawing/2016/5/11/chartex" xmlns:cx6="http://schemas.microsoft.com/office/drawing/2016/5/12/chartex" xmlns:cx7="http://schemas.microsoft.com/office/drawing/2016/5/13/chartex" xmlns:cx8="http://schemas.microsoft.com/office/drawing/2016/5/14/chartex" xmlns:mc="http://schemas.openxmlformats.org/markup-compatibility/2006" xmlns:aink="http://schemas.microsoft.com/office/drawing/2016/ink" xmlns:am3d="http://schemas.microsoft.com/office/drawing/2017/model3d" xmlns:o="urn:schemas-microsoft-com:office:office" xmlns:oel="http://schemas.microsoft.com/office/2019/extlst" xmlns:r="http://schemas.openxmlformats.org/officeDocument/2006/relationships" xmlns:m="http://schemas.openxmlformats.org/officeDocument/2006/math" xmlns:v="urn:schemas-microsoft-com:vml" xmlns:wp14="http://schemas.microsoft.com/office/word/2010/wordprocessingDrawing" xmlns:wp="http://schemas.openxmlformats.org/drawingml/2006/wordprocessingDrawing" xmlns:w10="urn:schemas-microsoft-com:office:word" xmlns:w="http://schemas.openxmlformats.org/wordprocessingml/2006/main" xmlns:w14="http://schemas.microsoft.com/office/word/2010/wordml" xmlns:w15="http://schemas.microsoft.com/office/word/2012/wordml" xmlns:w16cex="http://schemas.microsoft.com/office/word/2018/wordml/cex" xmlns:w16cid="http://schemas.microsoft.com/office/word/2016/wordml/cid" xmlns:w16="http://schemas.microsoft.com/office/word/2018/wordml" xmlns:w16du="http://schemas.microsoft.com/office/word/2023/wordml/word16du" xmlns:w16sdtdh="http://schemas.microsoft.com/office/word/2020/wordml/sdtdatahash" xmlns:w16sdtfl="http://schemas.microsoft.com/office/word/2024/wordml/sdtformatlock" xmlns:w16se="http://schemas.microsoft.com/office/word/2015/wordml/symex" xmlns:wpg="http://schemas.microsoft.com/office/word/2010/wordprocessingGroup" xmlns:wpi="http://schemas.microsoft.com/office/word/2010/wordprocessingInk" xmlns:wne="http://schemas.microsoft.com/office/word/2006/wordml" xmlns:wps="http://schemas.microsoft.com/office/word/2010/wordprocessingShape" mc:Ignorable="w14 w15 w16se w16cid w16 w16cex w16sdtdh w16sdtfl w16du wp14">
   <w:body>
+    <w:p>
+      <w:pPr>
+        <w:rPr>
+          <w:rtl/>
+        </w:rPr>
+      </w:pPr>
+      <w:r>
+        <w:rPr>
+          <w:rFonts w:hint="cs"/>
+          <w:rtl/>
+        </w:rPr>
+        <w:t>کلاهه میزنیم که خطوط پررنگ شه بتونیم گرید رو پیدا کنیم</w:t>
+      </w:r>
+    </w:p>
+    <w:p>
+      <w:pPr>
+        <w:rPr>
+          <w:rFonts w:hint="cs"/>
+          <w:rtl/>
+        </w:rPr>
+      </w:pPr>
+      <w:r>
+        <w:rPr>
+          <w:rFonts w:hint="cs"/>
+          <w:rtl/>
+        </w:rPr>
+        <w:t xml:space="preserve">ولی بعدش که میخوایم سل اکسترکشن کنیم نیاز داریم که باینری کنیم هر سلول رو و اونجا کلاهه ای که زدیم دردسرسازه برای همین روی عکس اصلی </w:t>
+      </w:r>
+      <w:r>
+        <w:t>additive treshhold</w:t>
+      </w:r>
+      <w:r>
+        <w:rPr>
+          <w:rFonts w:hint="cs"/>
+          <w:rtl/>
+        </w:rPr>
+        <w:t xml:space="preserve"> میزنیم</w:t>
+      </w:r>
+    </w:p>
     <w:p>
       <w:pPr>
         <w:rPr>
@@ -932,6 +971,7 @@
     <w:p>
       <w:pPr>
         <w:rPr>
+          <w:rFonts w:hint="cs"/>
           <w:rtl/>
         </w:rPr>
       </w:pPr>
@@ -939,7 +979,6 @@
         <w:rPr>
           <w:noProof/>
         </w:rPr>
-        <w:lastRenderedPageBreak/>
         <w:drawing>
           <wp:inline distT="0" distB="0" distL="0" distR="0" wp14:anchorId="10DB7DE9" wp14:editId="7443D2E7">
             <wp:extent cx="374650" cy="374650"/>
@@ -1313,6 +1352,165 @@
           </wp:inline>
         </w:drawing>
       </w:r>
+      <w:r>
+        <w:rPr>
+          <w:noProof/>
+        </w:rPr>
+        <w:drawing>
+          <wp:inline distT="0" distB="0" distL="0" distR="0" wp14:anchorId="1786F5EB" wp14:editId="7B57CFB2">
+            <wp:extent cx="372745" cy="372745"/>
+            <wp:effectExtent l="0" t="0" r="8255" b="8255"/>
+            <wp:docPr id="246971458" name="Picture 26"/>
+            <wp:cNvGraphicFramePr>
+              <a:graphicFrameLocks xmlns:a="http://schemas.openxmlformats.org/drawingml/2006/main" noChangeAspect="1"/>
+            </wp:cNvGraphicFramePr>
+            <a:graphic xmlns:a="http://schemas.openxmlformats.org/drawingml/2006/main">
+              <a:graphicData uri="http://schemas.openxmlformats.org/drawingml/2006/picture">
+                <pic:pic xmlns:pic="http://schemas.openxmlformats.org/drawingml/2006/picture">
+                  <pic:nvPicPr>
+                    <pic:cNvPr id="0" name="Picture 52"/>
+                    <pic:cNvPicPr>
+                      <a:picLocks noChangeAspect="1" noChangeArrowheads="1"/>
+                    </pic:cNvPicPr>
+                  </pic:nvPicPr>
+                  <pic:blipFill>
+                    <a:blip r:embed="rId23">
+                      <a:extLst>
+                        <a:ext uri="{28A0092B-C50C-407E-A947-70E740481C1C}">
+                          <a14:useLocalDpi xmlns:a14="http://schemas.microsoft.com/office/drawing/2010/main" val="0"/>
+                        </a:ext>
+                      </a:extLst>
+                    </a:blip>
+                    <a:srcRect/>
+                    <a:stretch>
+                      <a:fillRect/>
+                    </a:stretch>
+                  </pic:blipFill>
+                  <pic:spPr bwMode="auto">
+                    <a:xfrm>
+                      <a:off x="0" y="0"/>
+                      <a:ext cx="372745" cy="372745"/>
+                    </a:xfrm>
+                    <a:prstGeom prst="rect">
+                      <a:avLst/>
+                    </a:prstGeom>
+                    <a:noFill/>
+                    <a:ln>
+                      <a:noFill/>
+                    </a:ln>
+                  </pic:spPr>
+                </pic:pic>
+              </a:graphicData>
+            </a:graphic>
+          </wp:inline>
+        </w:drawing>
+      </w:r>
+      <w:r>
+        <w:rPr>
+          <w:noProof/>
+        </w:rPr>
+        <w:drawing>
+          <wp:inline distT="0" distB="0" distL="0" distR="0" wp14:anchorId="2F950194" wp14:editId="7837EEA1">
+            <wp:extent cx="372745" cy="372745"/>
+            <wp:effectExtent l="0" t="0" r="8255" b="8255"/>
+            <wp:docPr id="33090351" name="Picture 25"/>
+            <wp:cNvGraphicFramePr>
+              <a:graphicFrameLocks xmlns:a="http://schemas.openxmlformats.org/drawingml/2006/main" noChangeAspect="1"/>
+            </wp:cNvGraphicFramePr>
+            <a:graphic xmlns:a="http://schemas.openxmlformats.org/drawingml/2006/main">
+              <a:graphicData uri="http://schemas.openxmlformats.org/drawingml/2006/picture">
+                <pic:pic xmlns:pic="http://schemas.openxmlformats.org/drawingml/2006/picture">
+                  <pic:nvPicPr>
+                    <pic:cNvPr id="0" name="Picture 51"/>
+                    <pic:cNvPicPr>
+                      <a:picLocks noChangeAspect="1" noChangeArrowheads="1"/>
+                    </pic:cNvPicPr>
+                  </pic:nvPicPr>
+                  <pic:blipFill>
+                    <a:blip r:embed="rId24">
+                      <a:extLst>
+                        <a:ext uri="{28A0092B-C50C-407E-A947-70E740481C1C}">
+                          <a14:useLocalDpi xmlns:a14="http://schemas.microsoft.com/office/drawing/2010/main" val="0"/>
+                        </a:ext>
+                      </a:extLst>
+                    </a:blip>
+                    <a:srcRect/>
+                    <a:stretch>
+                      <a:fillRect/>
+                    </a:stretch>
+                  </pic:blipFill>
+                  <pic:spPr bwMode="auto">
+                    <a:xfrm>
+                      <a:off x="0" y="0"/>
+                      <a:ext cx="372745" cy="372745"/>
+                    </a:xfrm>
+                    <a:prstGeom prst="rect">
+                      <a:avLst/>
+                    </a:prstGeom>
+                    <a:noFill/>
+                    <a:ln>
+                      <a:noFill/>
+                    </a:ln>
+                  </pic:spPr>
+                </pic:pic>
+              </a:graphicData>
+            </a:graphic>
+          </wp:inline>
+        </w:drawing>
+      </w:r>
+      <w:r>
+        <w:rPr>
+          <w:noProof/>
+        </w:rPr>
+        <w:drawing>
+          <wp:inline distT="0" distB="0" distL="0" distR="0" wp14:anchorId="026A5001" wp14:editId="5341C79F">
+            <wp:extent cx="372745" cy="372745"/>
+            <wp:effectExtent l="0" t="0" r="8255" b="8255"/>
+            <wp:docPr id="226881948" name="Picture 24"/>
+            <wp:cNvGraphicFramePr>
+              <a:graphicFrameLocks xmlns:a="http://schemas.openxmlformats.org/drawingml/2006/main" noChangeAspect="1"/>
+            </wp:cNvGraphicFramePr>
+            <a:graphic xmlns:a="http://schemas.openxmlformats.org/drawingml/2006/main">
+              <a:graphicData uri="http://schemas.openxmlformats.org/drawingml/2006/picture">
+                <pic:pic xmlns:pic="http://schemas.openxmlformats.org/drawingml/2006/picture">
+                  <pic:nvPicPr>
+                    <pic:cNvPr id="0" name="Picture 50"/>
+                    <pic:cNvPicPr>
+                      <a:picLocks noChangeAspect="1" noChangeArrowheads="1"/>
+                    </pic:cNvPicPr>
+                  </pic:nvPicPr>
+                  <pic:blipFill>
+                    <a:blip r:embed="rId25">
+                      <a:extLst>
+                        <a:ext uri="{28A0092B-C50C-407E-A947-70E740481C1C}">
+                          <a14:useLocalDpi xmlns:a14="http://schemas.microsoft.com/office/drawing/2010/main" val="0"/>
+                        </a:ext>
+                      </a:extLst>
+                    </a:blip>
+                    <a:srcRect/>
+                    <a:stretch>
+                      <a:fillRect/>
+                    </a:stretch>
+                  </pic:blipFill>
+                  <pic:spPr bwMode="auto">
+                    <a:xfrm>
+                      <a:off x="0" y="0"/>
+                      <a:ext cx="372745" cy="372745"/>
+                    </a:xfrm>
+                    <a:prstGeom prst="rect">
+                      <a:avLst/>
+                    </a:prstGeom>
+                    <a:noFill/>
+                    <a:ln>
+                      <a:noFill/>
+                    </a:ln>
+                  </pic:spPr>
+                </pic:pic>
+              </a:graphicData>
+            </a:graphic>
+          </wp:inline>
+        </w:drawing>
+      </w:r>
     </w:p>
     <w:p>
       <w:pPr>
@@ -1345,6 +1543,7 @@
     <w:p>
       <w:pPr>
         <w:rPr>
+          <w:rFonts w:hint="cs"/>
           <w:rtl/>
         </w:rPr>
       </w:pPr>
@@ -1365,6 +1564,11 @@
       </w:r>
     </w:p>
     <w:p>
+      <w:pPr>
+        <w:rPr>
+          <w:rtl/>
+        </w:rPr>
+      </w:pPr>
       <w:r>
         <w:rPr>
           <w:noProof/>
@@ -1387,7 +1591,7 @@
                     </pic:cNvPicPr>
                   </pic:nvPicPr>
                   <pic:blipFill>
-                    <a:blip r:embed="rId23">
+                    <a:blip r:embed="rId26">
                       <a:extLst>
                         <a:ext uri="{28A0092B-C50C-407E-A947-70E740481C1C}">
                           <a14:useLocalDpi xmlns:a14="http://schemas.microsoft.com/office/drawing/2010/main" val="0"/>
@@ -1440,7 +1644,7 @@
                     </pic:cNvPicPr>
                   </pic:nvPicPr>
                   <pic:blipFill>
-                    <a:blip r:embed="rId24">
+                    <a:blip r:embed="rId27">
                       <a:extLst>
                         <a:ext uri="{28A0092B-C50C-407E-A947-70E740481C1C}">
                           <a14:useLocalDpi xmlns:a14="http://schemas.microsoft.com/office/drawing/2010/main" val="0"/>
@@ -1496,7 +1700,7 @@
                     </pic:cNvPicPr>
                   </pic:nvPicPr>
                   <pic:blipFill>
-                    <a:blip r:embed="rId25">
+                    <a:blip r:embed="rId28">
                       <a:extLst>
                         <a:ext uri="{28A0092B-C50C-407E-A947-70E740481C1C}">
                           <a14:useLocalDpi xmlns:a14="http://schemas.microsoft.com/office/drawing/2010/main" val="0"/>
@@ -1533,6 +1737,260 @@
           <w:rtl/>
         </w:rPr>
         <w:t>؟؟؟</w:t>
+      </w:r>
+    </w:p>
+    <w:p>
+      <w:pPr>
+        <w:rPr>
+          <w:rtl/>
+        </w:rPr>
+      </w:pPr>
+    </w:p>
+    <w:p>
+      <w:pPr>
+        <w:rPr>
+          <w:rtl/>
+        </w:rPr>
+      </w:pPr>
+    </w:p>
+    <w:p>
+      <w:pPr>
+        <w:rPr>
+          <w:rtl/>
+        </w:rPr>
+      </w:pPr>
+    </w:p>
+    <w:p>
+      <w:pPr>
+        <w:rPr>
+          <w:rtl/>
+        </w:rPr>
+      </w:pPr>
+      <w:r>
+        <w:rPr>
+          <w:rFonts w:hint="cs"/>
+          <w:rtl/>
+        </w:rPr>
+        <w:t>چالشهایی که توی رفع نویز داشتیم:</w:t>
+      </w:r>
+    </w:p>
+    <w:p>
+      <w:pPr>
+        <w:rPr>
+          <w:rtl/>
+        </w:rPr>
+      </w:pPr>
+      <w:r>
+        <w:rPr>
+          <w:rFonts w:hint="cs"/>
+          <w:rtl/>
+        </w:rPr>
+        <w:t xml:space="preserve">روی عکس اصلی </w:t>
+      </w:r>
+      <w:r>
+        <w:rPr>
+          <w:rFonts w:hint="cs"/>
+          <w:rtl/>
+        </w:rPr>
+        <w:t>کلاهه میزنیم که خطوط پررنگ شه بتونیم گرید رو پیدا کنیم</w:t>
+      </w:r>
+    </w:p>
+    <w:p>
+      <w:pPr>
+        <w:rPr>
+          <w:rFonts w:hint="cs"/>
+          <w:rtl/>
+        </w:rPr>
+      </w:pPr>
+      <w:r>
+        <w:rPr>
+          <w:rFonts w:hint="cs"/>
+          <w:rtl/>
+        </w:rPr>
+        <w:t>ولی بعدش که میخوایم سل اکسترکشن کنیم نیاز داریم که باینری کنیم هر سلول رو و اونجا کلاهه ای که زدیم دردسرسازه</w:t>
+      </w:r>
+      <w:r>
+        <w:rPr>
+          <w:rFonts w:hint="cs"/>
+          <w:rtl/>
+        </w:rPr>
+        <w:t xml:space="preserve"> چون توی باینری کردن 0و1 ای شون میکنه.</w:t>
+      </w:r>
+      <w:r>
+        <w:rPr>
+          <w:rFonts w:hint="cs"/>
+          <w:rtl/>
+        </w:rPr>
+        <w:t xml:space="preserve"> برای همین روی عکس اصلی </w:t>
+      </w:r>
+      <w:r>
+        <w:t>additive treshhold</w:t>
+      </w:r>
+      <w:r>
+        <w:rPr>
+          <w:rFonts w:hint="cs"/>
+          <w:rtl/>
+        </w:rPr>
+        <w:t xml:space="preserve"> میزنیم</w:t>
+      </w:r>
+      <w:r>
+        <w:rPr>
+          <w:rFonts w:hint="cs"/>
+          <w:rtl/>
+        </w:rPr>
+        <w:t xml:space="preserve"> ولی فقط و فقط درصورتی اینو میزنیم که کنتراستی که از کلاهه اومده در اون تیکه، کم باشه. یعنی چی مثلا یه عکس خاکستری بعد از کلاهه رسیده دستمون. اگه مستقیم باینری کنیم بد میشه. اول چک میشه که کنتراست </w:t>
+      </w:r>
+      <w:r>
+        <w:rPr>
+          <w:rFonts w:hint="cs"/>
+          <w:rtl/>
+        </w:rPr>
+        <w:t xml:space="preserve">اون سلول آیا در </w:t>
+      </w:r>
+      <w:r>
+        <w:t>final_wraped</w:t>
+      </w:r>
+      <w:r>
+        <w:rPr>
+          <w:rFonts w:hint="cs"/>
+          <w:rtl/>
+        </w:rPr>
+        <w:t xml:space="preserve"> کم هست </w:t>
+      </w:r>
+      <w:r>
+        <w:rPr>
+          <w:rFonts w:hint="cs"/>
+          <w:rtl/>
+        </w:rPr>
+        <w:t xml:space="preserve">یا نه. اگه کم بود </w:t>
+      </w:r>
+      <w:r>
+        <w:rPr>
+          <w:rFonts w:hint="cs"/>
+          <w:rtl/>
+        </w:rPr>
+        <w:t xml:space="preserve">پس </w:t>
+      </w:r>
+      <w:r>
+        <w:t>additive treshhold</w:t>
+      </w:r>
+      <w:r>
+        <w:rPr>
+          <w:rFonts w:hint="cs"/>
+          <w:rtl/>
+        </w:rPr>
+        <w:t xml:space="preserve"> میزنیم روی تصویر اصلی</w:t>
+      </w:r>
+      <w:r>
+        <w:t xml:space="preserve"> </w:t>
+      </w:r>
+      <w:r>
+        <w:t>final_wraped_original</w:t>
+      </w:r>
+      <w:r>
+        <w:rPr>
+          <w:rFonts w:hint="cs"/>
+          <w:rtl/>
+        </w:rPr>
+        <w:t xml:space="preserve"> </w:t>
+      </w:r>
+      <w:r>
+        <w:rPr>
+          <w:rFonts w:hint="cs"/>
+          <w:rtl/>
+        </w:rPr>
+        <w:t xml:space="preserve">، اگه نه کنتراست تصویر اوکیه روی همون </w:t>
+      </w:r>
+      <w:r>
+        <w:t>final_wraped</w:t>
+      </w:r>
+      <w:r>
+        <w:rPr>
+          <w:rFonts w:hint="cs"/>
+          <w:rtl/>
+        </w:rPr>
+        <w:t xml:space="preserve">  </w:t>
+      </w:r>
+      <w:r>
+        <w:rPr>
+          <w:rFonts w:hint="cs"/>
+          <w:rtl/>
+        </w:rPr>
+        <w:t>اوتسو میزنیم</w:t>
+      </w:r>
+    </w:p>
+    <w:p>
+      <w:pPr>
+        <w:rPr>
+          <w:rtl/>
+        </w:rPr>
+      </w:pPr>
+      <w:r>
+        <w:rPr>
+          <w:noProof/>
+        </w:rPr>
+        <w:drawing>
+          <wp:inline distT="0" distB="0" distL="0" distR="0" wp14:anchorId="5950E868" wp14:editId="083EE410">
+            <wp:extent cx="1662081" cy="1955237"/>
+            <wp:effectExtent l="0" t="0" r="0" b="6985"/>
+            <wp:docPr id="1220048724" name="Picture 27"/>
+            <wp:cNvGraphicFramePr>
+              <a:graphicFrameLocks xmlns:a="http://schemas.openxmlformats.org/drawingml/2006/main" noChangeAspect="1"/>
+            </wp:cNvGraphicFramePr>
+            <a:graphic xmlns:a="http://schemas.openxmlformats.org/drawingml/2006/main">
+              <a:graphicData uri="http://schemas.openxmlformats.org/drawingml/2006/picture">
+                <pic:pic xmlns:pic="http://schemas.openxmlformats.org/drawingml/2006/picture">
+                  <pic:nvPicPr>
+                    <pic:cNvPr id="0" name="Picture 56"/>
+                    <pic:cNvPicPr>
+                      <a:picLocks noChangeAspect="1" noChangeArrowheads="1"/>
+                    </pic:cNvPicPr>
+                  </pic:nvPicPr>
+                  <pic:blipFill>
+                    <a:blip r:embed="rId29" cstate="print">
+                      <a:extLst>
+                        <a:ext uri="{28A0092B-C50C-407E-A947-70E740481C1C}">
+                          <a14:useLocalDpi xmlns:a14="http://schemas.microsoft.com/office/drawing/2010/main" val="0"/>
+                        </a:ext>
+                      </a:extLst>
+                    </a:blip>
+                    <a:srcRect/>
+                    <a:stretch>
+                      <a:fillRect/>
+                    </a:stretch>
+                  </pic:blipFill>
+                  <pic:spPr bwMode="auto">
+                    <a:xfrm>
+                      <a:off x="0" y="0"/>
+                      <a:ext cx="1667918" cy="1962104"/>
+                    </a:xfrm>
+                    <a:prstGeom prst="rect">
+                      <a:avLst/>
+                    </a:prstGeom>
+                    <a:noFill/>
+                    <a:ln>
+                      <a:noFill/>
+                    </a:ln>
+                  </pic:spPr>
+                </pic:pic>
+              </a:graphicData>
+            </a:graphic>
+          </wp:inline>
+        </w:drawing>
+      </w:r>
+    </w:p>
+    <w:p>
+      <w:pPr>
+        <w:rPr>
+          <w:rFonts w:hint="cs"/>
+        </w:rPr>
+      </w:pPr>
+      <w:r>
+        <w:rPr>
+          <w:rFonts w:hint="cs"/>
+          <w:rtl/>
+        </w:rPr>
+        <w:t>مثال خوبی از دلیل این کار</w:t>
       </w:r>
     </w:p>
     <w:sectPr>
@@ -1947,6 +2405,7 @@
   <w:style w:type="paragraph" w:default="1" w:styleId="Normal">
     <w:name w:val="Normal"/>
     <w:qFormat/>
+    <w:rsid w:val="00BD771F"/>
     <w:pPr>
       <w:bidi/>
     </w:pPr>

</xml_diff>